<commit_message>
first push v1 project
</commit_message>
<xml_diff>
--- a/templates/Automation_SDD_template.docx
+++ b/templates/Automation_SDD_template.docx
@@ -40,29 +40,6 @@
           <w:p>
             <w:r>
               <w:t>{{project_name}}</w:t>
-            </w:r>
-          </w:p>
-        </w:tc>
-      </w:tr>
-      <w:tr>
-        <w:tc>
-          <w:tcPr>
-            <w:tcW w:w="3060" w:type="dxa"/>
-            <w:shd w:val="clear" w:color="auto" w:fill="F2F2F2" w:themeFill="background1" w:themeFillShade="F2"/>
-          </w:tcPr>
-          <w:p>
-            <w:r>
-              <w:t>Flow Diagrams Location</w:t>
-            </w:r>
-          </w:p>
-        </w:tc>
-        <w:tc>
-          <w:tcPr>
-            <w:tcW w:w="7200" w:type="dxa"/>
-          </w:tcPr>
-          <w:p>
-            <w:r>
-              <w:t>{{flow_diagrams_location}}</w:t>
             </w:r>
           </w:p>
         </w:tc>

</xml_diff>